<commit_message>
Generando y optimizando consumo_gas_natural_porcentaje_maximo_aleatorio_interpretacion_representacion_n2_v1.Rmd
</commit_message>
<xml_diff>
--- a/Lab/11-S1-2025-SEDQ/salida/consumo_gas_natural_porcentaje_maximo_aleatorio_interpretacion_representacion_n2_v1_1.docx
+++ b/Lab/11-S1-2025-SEDQ/salida/consumo_gas_natural_porcentaje_maximo_aleatorio_interpretacion_representacion_n2_v1_1.docx
@@ -53,32 +53,7 @@
         <w:br/>
       </w:r>
       <w:r>
-        <w:t xml:space="preserve">Antonio y Alejandra viven en un apartamento y comparten el pago de los gastos. En octubre consumieron 15 metros cúbicos de gas natural y la factura fue de</w:t>
-      </w:r>
-      <w:r>
-        <w:t xml:space="preserve"> </w:t>
-      </w:r>
-      <m:oMath>
-        <m:r>
-          <m:t>17.700</m:t>
-        </m:r>
-      </m:oMath>
-      <w:r>
-        <w:t xml:space="preserve">, incluido el cargo fijo de</w:t>
-      </w:r>
-      <w:r>
-        <w:t xml:space="preserve"> </w:t>
-      </w:r>
-      <m:oMath>
-        <m:r>
-          <m:t>2.700</m:t>
-        </m:r>
-      </m:oMath>
-      <w:r>
-        <w:t xml:space="preserve"> </w:t>
-      </w:r>
-      <w:r>
-        <w:t xml:space="preserve">que es el mismo todos los meses. La gráfica muestra el consumo histórico en metros cúbicos de ese servicio.</w:t>
+        <w:t xml:space="preserve">Francisco y Daniela viven en un hogar y comparten el pago de los gastos. En agosto consumieron 13 metros cúbicos de gas natural y la factura fue de $15.050, incluido el cargo fijo de $2.700 que es el mismo todos los meses. La gráfica muestra el consumo histórico en metros cúbicos de ese servicio.</w:t>
       </w:r>
     </w:p>
     <w:p>
@@ -139,7 +114,7 @@
         </w:numPr>
       </w:pPr>
       <w:r>
-        <w:t xml:space="preserve">Un hogar puede consumir máximo 18 metros cúbicos en un mes. ¿A qué porcentaje del consumo máximo posible corresponde el consumo de junio?</w:t>
+        <w:t xml:space="preserve">Un hogar puede consumir máximo 25 metros cúbicos en un mes. ¿A qué porcentaje del consumo máximo posible corresponde el consumo de mayo?</w:t>
       </w:r>
     </w:p>
     <w:p>
@@ -150,7 +125,7 @@
         </w:numPr>
       </w:pPr>
       <w:r>
-        <w:t xml:space="preserve">55%</w:t>
+        <w:t xml:space="preserve">71%</w:t>
       </w:r>
     </w:p>
     <w:p>
@@ -161,7 +136,7 @@
         </w:numPr>
       </w:pPr>
       <w:r>
-        <w:t xml:space="preserve">87%</w:t>
+        <w:t xml:space="preserve">52%</w:t>
       </w:r>
     </w:p>
     <w:p>
@@ -172,7 +147,7 @@
         </w:numPr>
       </w:pPr>
       <w:r>
-        <w:t xml:space="preserve">13%</w:t>
+        <w:t xml:space="preserve">60%</w:t>
       </w:r>
     </w:p>
     <w:p>
@@ -183,7 +158,7 @@
         </w:numPr>
       </w:pPr>
       <w:r>
-        <w:t xml:space="preserve">72%</w:t>
+        <w:t xml:space="preserve">15%</w:t>
       </w:r>
     </w:p>
     <w:p>
@@ -343,7 +318,7 @@
         </w:numPr>
       </w:pPr>
       <w:r>
-        <w:t xml:space="preserve">Observando la gráfica de consumo histórico de Antonio y Alejandra:</w:t>
+        <w:t xml:space="preserve">Observando la gráfica de consumo histórico de Francisco y Daniela:</w:t>
       </w:r>
     </w:p>
     <w:p>
@@ -369,7 +344,7 @@
         </w:numPr>
       </w:pPr>
       <w:r>
-        <w:t xml:space="preserve">Abril: 13 metros cúbicos</w:t>
+        <w:t xml:space="preserve">Febrero: 12 metros cúbicos</w:t>
       </w:r>
     </w:p>
     <w:p>
@@ -380,7 +355,7 @@
         </w:numPr>
       </w:pPr>
       <w:r>
-        <w:t xml:space="preserve">Mayo: 13 metros cúbicos</w:t>
+        <w:t xml:space="preserve">Marzo: 14 metros cúbicos</w:t>
       </w:r>
     </w:p>
     <w:p>
@@ -391,6 +366,38 @@
         </w:numPr>
       </w:pPr>
       <w:r>
+        <w:t xml:space="preserve">Abril: 14 metros cúbicos</w:t>
+      </w:r>
+    </w:p>
+    <w:p>
+      <w:pPr>
+        <w:numPr>
+          <w:ilvl w:val="1"/>
+          <w:numId w:val="1004"/>
+        </w:numPr>
+      </w:pPr>
+      <w:r>
+        <w:t xml:space="preserve">Mayo: 15 metros cúbicos ←</w:t>
+      </w:r>
+      <w:r>
+        <w:t xml:space="preserve"> </w:t>
+      </w:r>
+      <w:r>
+        <w:rPr>
+          <w:b/>
+          <w:bCs/>
+        </w:rPr>
+        <w:t xml:space="preserve">MES DE LA PREGUNTA</w:t>
+      </w:r>
+    </w:p>
+    <w:p>
+      <w:pPr>
+        <w:numPr>
+          <w:ilvl w:val="1"/>
+          <w:numId w:val="1004"/>
+        </w:numPr>
+      </w:pPr>
+      <w:r>
         <w:t xml:space="preserve">Junio: 13 metros cúbicos</w:t>
       </w:r>
     </w:p>
@@ -402,7 +409,7 @@
         </w:numPr>
       </w:pPr>
       <w:r>
-        <w:t xml:space="preserve">Julio: 11 metros cúbicos</w:t>
+        <w:t xml:space="preserve">Julio: 13 metros cúbicos</w:t>
       </w:r>
     </w:p>
     <w:p>
@@ -413,44 +420,32 @@
         </w:numPr>
       </w:pPr>
       <w:r>
-        <w:t xml:space="preserve">Agosto: 12 metros cúbicos</w:t>
-      </w:r>
-    </w:p>
-    <w:p>
-      <w:pPr>
-        <w:numPr>
-          <w:ilvl w:val="1"/>
-          <w:numId w:val="1004"/>
-        </w:numPr>
-      </w:pPr>
-      <w:r>
-        <w:t xml:space="preserve">Septiembre: 14 metros cúbicos</w:t>
-      </w:r>
-    </w:p>
-    <w:p>
-      <w:pPr>
-        <w:numPr>
-          <w:ilvl w:val="1"/>
-          <w:numId w:val="1004"/>
-        </w:numPr>
-      </w:pPr>
-      <w:r>
-        <w:t xml:space="preserve">Octubre: 15 metros cúbicos</w:t>
-      </w:r>
-    </w:p>
-    <w:p>
-      <w:pPr>
-        <w:numPr>
-          <w:ilvl w:val="0"/>
-          <w:numId w:val="1000"/>
-        </w:numPr>
-      </w:pPr>
-      <w:r>
-        <w:rPr>
-          <w:b/>
-          <w:bCs/>
-        </w:rPr>
-        <w:t xml:space="preserve">El consumo de junio fue de 13 metros cúbicos.</w:t>
+        <w:t xml:space="preserve">Agosto: 13 metros cúbicos ←</w:t>
+      </w:r>
+      <w:r>
+        <w:t xml:space="preserve"> </w:t>
+      </w:r>
+      <w:r>
+        <w:rPr>
+          <w:b/>
+          <w:bCs/>
+        </w:rPr>
+        <w:t xml:space="preserve">MES DE LA FACTURA</w:t>
+      </w:r>
+    </w:p>
+    <w:p>
+      <w:pPr>
+        <w:numPr>
+          <w:ilvl w:val="0"/>
+          <w:numId w:val="1000"/>
+        </w:numPr>
+      </w:pPr>
+      <w:r>
+        <w:rPr>
+          <w:b/>
+          <w:bCs/>
+        </w:rPr>
+        <w:t xml:space="preserve">El consumo de mayo fue de 15 metros cúbicos.</w:t>
       </w:r>
     </w:p>
     <w:p>
@@ -485,7 +480,7 @@
         <w:t xml:space="preserve"> </w:t>
       </w:r>
       <w:r>
-        <w:t xml:space="preserve">18 metros cúbicos (dato del enunciado)</w:t>
+        <w:t xml:space="preserve">25 metros cúbicos (dato del enunciado)</w:t>
       </w:r>
     </w:p>
     <w:p>
@@ -500,13 +495,13 @@
           <w:b/>
           <w:bCs/>
         </w:rPr>
-        <w:t xml:space="preserve">Consumo real de junio:</w:t>
+        <w:t xml:space="preserve">Consumo real de mayo:</w:t>
       </w:r>
       <w:r>
         <w:t xml:space="preserve"> </w:t>
       </w:r>
       <w:r>
-        <w:t xml:space="preserve">13 metros cúbicos (dato de la gráfica)</w:t>
+        <w:t xml:space="preserve">15 metros cúbicos (dato de la gráfica)</w:t>
       </w:r>
     </w:p>
     <w:p>
@@ -636,12 +631,12 @@
             </m:fPr>
             <m:num>
               <m:r>
-                <m:t>13</m:t>
+                <m:t>15</m:t>
               </m:r>
             </m:num>
             <m:den>
               <m:r>
-                <m:t>18</m:t>
+                <m:t>25</m:t>
               </m:r>
             </m:den>
           </m:f>
@@ -667,7 +662,7 @@
             <m:t>=</m:t>
           </m:r>
           <m:r>
-            <m:t>72</m:t>
+            <m:t>60</m:t>
           </m:r>
           <m:r>
             <m:rPr>
@@ -710,7 +705,7 @@
         <w:t xml:space="preserve"> </w:t>
       </w:r>
       <w:r>
-        <w:t xml:space="preserve">72%</w:t>
+        <w:t xml:space="preserve">60%</w:t>
       </w:r>
     </w:p>
     <w:p>
@@ -740,10 +735,10 @@
           <w:b/>
           <w:bCs/>
         </w:rPr>
-        <w:t xml:space="preserve">13%</w:t>
-      </w:r>
-      <w:r>
-        <w:t xml:space="preserve">: Error conceptual - confundir el valor absoluto (13 m³) con el porcentaje</w:t>
+        <w:t xml:space="preserve">15%</w:t>
+      </w:r>
+      <w:r>
+        <w:t xml:space="preserve">: Error conceptual - confundir el valor absoluto (15 m³) con el porcentaje</w:t>
       </w:r>
     </w:p>
     <w:p>
@@ -758,7 +753,25 @@
           <w:b/>
           <w:bCs/>
         </w:rPr>
-        <w:t xml:space="preserve">87%</w:t>
+        <w:t xml:space="preserve">52%</w:t>
+      </w:r>
+      <w:r>
+        <w:t xml:space="preserve">: Error de lectura - usar el consumo de junio en lugar de mayo</w:t>
+      </w:r>
+    </w:p>
+    <w:p>
+      <w:pPr>
+        <w:numPr>
+          <w:ilvl w:val="1"/>
+          <w:numId w:val="1006"/>
+        </w:numPr>
+      </w:pPr>
+      <w:r>
+        <w:rPr>
+          <w:b/>
+          <w:bCs/>
+        </w:rPr>
+        <w:t xml:space="preserve">71%</w:t>
       </w:r>
       <w:r>
         <w:t xml:space="preserve">: Error de cálculo - aplicar incorrectamente la fórmula de porcentaje</w:t>
@@ -766,24 +779,6 @@
     </w:p>
     <w:p>
       <w:pPr>
-        <w:numPr>
-          <w:ilvl w:val="1"/>
-          <w:numId w:val="1006"/>
-        </w:numPr>
-      </w:pPr>
-      <w:r>
-        <w:rPr>
-          <w:b/>
-          <w:bCs/>
-        </w:rPr>
-        <w:t xml:space="preserve">55%</w:t>
-      </w:r>
-      <w:r>
-        <w:t xml:space="preserve">: Error de cálculo - aplicar incorrectamente la fórmula de porcentaje</w:t>
-      </w:r>
-    </w:p>
-    <w:p>
-      <w:pPr>
         <w:pStyle w:val="Heading3"/>
         <w:numPr>
           <w:ilvl w:val="0"/>
@@ -804,7 +799,7 @@
         </w:numPr>
       </w:pPr>
       <w:r>
-        <w:t xml:space="preserve">El consumo de junio (13 metros cúbicos) representa el</w:t>
+        <w:t xml:space="preserve">El consumo de mayo (15 metros cúbicos) representa el</w:t>
       </w:r>
       <w:r>
         <w:t xml:space="preserve"> </w:t>
@@ -814,13 +809,13 @@
           <w:b/>
           <w:bCs/>
         </w:rPr>
-        <w:t xml:space="preserve">72%</w:t>
+        <w:t xml:space="preserve">60%</w:t>
       </w:r>
       <w:r>
         <w:t xml:space="preserve"> </w:t>
       </w:r>
       <w:r>
-        <w:t xml:space="preserve">del consumo máximo posible (18 metros cúbicos).</w:t>
+        <w:t xml:space="preserve">del consumo máximo posible (25 metros cúbicos).</w:t>
       </w:r>
     </w:p>
     <w:p>
@@ -870,6 +865,24 @@
     <w:p>
       <w:pPr>
         <w:numPr>
+          <w:ilvl w:val="0"/>
+          <w:numId w:val="1000"/>
+        </w:numPr>
+      </w:pPr>
+      <w:r>
+        <w:rPr>
+          <w:b/>
+          <w:bCs/>
+        </w:rPr>
+        <w:t xml:space="preserve">Verificación adicional</w:t>
+      </w:r>
+      <w:r>
+        <w:t xml:space="preserve">: La factura de agosto ($15.050) corresponde exactamente al consumo mostrado en la gráfica (13 m³ × $950 + $2.700 cargo fijo).</w:t>
+      </w:r>
+    </w:p>
+    <w:p>
+      <w:pPr>
+        <w:numPr>
           <w:ilvl w:val="1"/>
           <w:numId w:val="1008"/>
         </w:numPr>
@@ -897,23 +910,23 @@
         </w:numPr>
       </w:pPr>
       <w:r>
+        <w:t xml:space="preserve">Correcto</w:t>
+      </w:r>
+    </w:p>
+    <w:p>
+      <w:pPr>
+        <w:numPr>
+          <w:ilvl w:val="1"/>
+          <w:numId w:val="1008"/>
+        </w:numPr>
+      </w:pPr>
+      <w:r>
         <w:t xml:space="preserve">Incorrecto</w:t>
       </w:r>
     </w:p>
     <w:p>
       <w:pPr>
         <w:numPr>
-          <w:ilvl w:val="1"/>
-          <w:numId w:val="1008"/>
-        </w:numPr>
-      </w:pPr>
-      <w:r>
-        <w:t xml:space="preserve">Correcto</w:t>
-      </w:r>
-    </w:p>
-    <w:p>
-      <w:pPr>
-        <w:numPr>
           <w:ilvl w:val="0"/>
           <w:numId w:val="1001"/>
         </w:numPr>
@@ -929,32 +942,7 @@
         <w:br/>
       </w:r>
       <w:r>
-        <w:t xml:space="preserve">Miguel y Isabella viven en un apartamento y comparten el pago de los gastos. En octubre consumieron 15 metros cúbicos de gas natural y la factura fue de</w:t>
-      </w:r>
-      <w:r>
-        <w:t xml:space="preserve"> </w:t>
-      </w:r>
-      <m:oMath>
-        <m:r>
-          <m:t>18.750</m:t>
-        </m:r>
-      </m:oMath>
-      <w:r>
-        <w:t xml:space="preserve">, incluido el cargo fijo de</w:t>
-      </w:r>
-      <w:r>
-        <w:t xml:space="preserve"> </w:t>
-      </w:r>
-      <m:oMath>
-        <m:r>
-          <m:t>3.000</m:t>
-        </m:r>
-      </m:oMath>
-      <w:r>
-        <w:t xml:space="preserve"> </w:t>
-      </w:r>
-      <w:r>
-        <w:t xml:space="preserve">que es el mismo todos los meses. La gráfica muestra el consumo histórico en metros cúbicos de ese servicio.</w:t>
+        <w:t xml:space="preserve">Isabella y Miguel viven en un apartamento y comparten el pago de los gastos. En septiembre consumieron 11 metros cúbicos de gas natural y la factura fue de $12.150, incluido el cargo fijo de $2.800 que es el mismo todos los meses. La gráfica muestra el consumo histórico en metros cúbicos de ese servicio.</w:t>
       </w:r>
     </w:p>
     <w:p>
@@ -1015,7 +1003,7 @@
         </w:numPr>
       </w:pPr>
       <w:r>
-        <w:t xml:space="preserve">Un hogar puede consumir máximo 20 metros cúbicos en un mes. ¿A qué porcentaje del consumo máximo posible corresponde el consumo de junio?</w:t>
+        <w:t xml:space="preserve">Un hogar puede consumir máximo 20 metros cúbicos en un mes. ¿A qué porcentaje del consumo máximo posible corresponde el consumo de abril?</w:t>
       </w:r>
     </w:p>
     <w:p>
@@ -1026,7 +1014,7 @@
         </w:numPr>
       </w:pPr>
       <w:r>
-        <w:t xml:space="preserve">94%</w:t>
+        <w:t xml:space="preserve">60%</w:t>
       </w:r>
     </w:p>
     <w:p>
@@ -1037,7 +1025,7 @@
         </w:numPr>
       </w:pPr>
       <w:r>
-        <w:t xml:space="preserve">60%</w:t>
+        <w:t xml:space="preserve">12%</w:t>
       </w:r>
     </w:p>
     <w:p>
@@ -1048,7 +1036,7 @@
         </w:numPr>
       </w:pPr>
       <w:r>
-        <w:t xml:space="preserve">75%</w:t>
+        <w:t xml:space="preserve">15%</w:t>
       </w:r>
     </w:p>
     <w:p>
@@ -1059,7 +1047,7 @@
         </w:numPr>
       </w:pPr>
       <w:r>
-        <w:t xml:space="preserve">15%</w:t>
+        <w:t xml:space="preserve">67%</w:t>
       </w:r>
     </w:p>
     <w:p>
@@ -1219,7 +1207,7 @@
         </w:numPr>
       </w:pPr>
       <w:r>
-        <w:t xml:space="preserve">Observando la gráfica de consumo histórico de Miguel y Isabella:</w:t>
+        <w:t xml:space="preserve">Observando la gráfica de consumo histórico de Isabella y Miguel:</w:t>
       </w:r>
     </w:p>
     <w:p>
@@ -1245,7 +1233,7 @@
         </w:numPr>
       </w:pPr>
       <w:r>
-        <w:t xml:space="preserve">Abril: 11 metros cúbicos</w:t>
+        <w:t xml:space="preserve">Marzo: 12 metros cúbicos</w:t>
       </w:r>
     </w:p>
     <w:p>
@@ -1256,7 +1244,17 @@
         </w:numPr>
       </w:pPr>
       <w:r>
-        <w:t xml:space="preserve">Mayo: 14 metros cúbicos</w:t>
+        <w:t xml:space="preserve">Abril: 12 metros cúbicos ←</w:t>
+      </w:r>
+      <w:r>
+        <w:t xml:space="preserve"> </w:t>
+      </w:r>
+      <w:r>
+        <w:rPr>
+          <w:b/>
+          <w:bCs/>
+        </w:rPr>
+        <w:t xml:space="preserve">MES DE LA PREGUNTA</w:t>
       </w:r>
     </w:p>
     <w:p>
@@ -1267,7 +1265,7 @@
         </w:numPr>
       </w:pPr>
       <w:r>
-        <w:t xml:space="preserve">Junio: 15 metros cúbicos</w:t>
+        <w:t xml:space="preserve">Mayo: 15 metros cúbicos</w:t>
       </w:r>
     </w:p>
     <w:p>
@@ -1278,7 +1276,7 @@
         </w:numPr>
       </w:pPr>
       <w:r>
-        <w:t xml:space="preserve">Julio: 13 metros cúbicos</w:t>
+        <w:t xml:space="preserve">Junio: 14 metros cúbicos</w:t>
       </w:r>
     </w:p>
     <w:p>
@@ -1289,7 +1287,7 @@
         </w:numPr>
       </w:pPr>
       <w:r>
-        <w:t xml:space="preserve">Agosto: 11 metros cúbicos</w:t>
+        <w:t xml:space="preserve">Julio: 10 metros cúbicos</w:t>
       </w:r>
     </w:p>
     <w:p>
@@ -1300,7 +1298,7 @@
         </w:numPr>
       </w:pPr>
       <w:r>
-        <w:t xml:space="preserve">Septiembre: 12 metros cúbicos</w:t>
+        <w:t xml:space="preserve">Agosto: 12 metros cúbicos</w:t>
       </w:r>
     </w:p>
     <w:p>
@@ -1311,22 +1309,32 @@
         </w:numPr>
       </w:pPr>
       <w:r>
-        <w:t xml:space="preserve">Octubre: 15 metros cúbicos</w:t>
-      </w:r>
-    </w:p>
-    <w:p>
-      <w:pPr>
-        <w:numPr>
-          <w:ilvl w:val="0"/>
-          <w:numId w:val="1000"/>
-        </w:numPr>
-      </w:pPr>
-      <w:r>
-        <w:rPr>
-          <w:b/>
-          <w:bCs/>
-        </w:rPr>
-        <w:t xml:space="preserve">El consumo de junio fue de 15 metros cúbicos.</w:t>
+        <w:t xml:space="preserve">Septiembre: 11 metros cúbicos ←</w:t>
+      </w:r>
+      <w:r>
+        <w:t xml:space="preserve"> </w:t>
+      </w:r>
+      <w:r>
+        <w:rPr>
+          <w:b/>
+          <w:bCs/>
+        </w:rPr>
+        <w:t xml:space="preserve">MES DE LA FACTURA</w:t>
+      </w:r>
+    </w:p>
+    <w:p>
+      <w:pPr>
+        <w:numPr>
+          <w:ilvl w:val="0"/>
+          <w:numId w:val="1000"/>
+        </w:numPr>
+      </w:pPr>
+      <w:r>
+        <w:rPr>
+          <w:b/>
+          <w:bCs/>
+        </w:rPr>
+        <w:t xml:space="preserve">El consumo de abril fue de 12 metros cúbicos.</w:t>
       </w:r>
     </w:p>
     <w:p>
@@ -1376,13 +1384,13 @@
           <w:b/>
           <w:bCs/>
         </w:rPr>
-        <w:t xml:space="preserve">Consumo real de junio:</w:t>
+        <w:t xml:space="preserve">Consumo real de abril:</w:t>
       </w:r>
       <w:r>
         <w:t xml:space="preserve"> </w:t>
       </w:r>
       <w:r>
-        <w:t xml:space="preserve">15 metros cúbicos (dato de la gráfica)</w:t>
+        <w:t xml:space="preserve">12 metros cúbicos (dato de la gráfica)</w:t>
       </w:r>
     </w:p>
     <w:p>
@@ -1512,7 +1520,7 @@
             </m:fPr>
             <m:num>
               <m:r>
-                <m:t>15</m:t>
+                <m:t>12</m:t>
               </m:r>
             </m:num>
             <m:den>
@@ -1543,7 +1551,7 @@
             <m:t>=</m:t>
           </m:r>
           <m:r>
-            <m:t>75</m:t>
+            <m:t>60</m:t>
           </m:r>
           <m:r>
             <m:rPr>
@@ -1586,7 +1594,7 @@
         <w:t xml:space="preserve"> </w:t>
       </w:r>
       <w:r>
-        <w:t xml:space="preserve">75%</w:t>
+        <w:t xml:space="preserve">60%</w:t>
       </w:r>
     </w:p>
     <w:p>
@@ -1616,19 +1624,75 @@
           <w:b/>
           <w:bCs/>
         </w:rPr>
+        <w:t xml:space="preserve">12%</w:t>
+      </w:r>
+      <w:r>
+        <w:t xml:space="preserve">: Error conceptual - confundir el valor absoluto (12 m³) con el porcentaje</w:t>
+      </w:r>
+    </w:p>
+    <w:p>
+      <w:pPr>
+        <w:numPr>
+          <w:ilvl w:val="1"/>
+          <w:numId w:val="1013"/>
+        </w:numPr>
+      </w:pPr>
+      <w:r>
+        <w:rPr>
+          <w:b/>
+          <w:bCs/>
+        </w:rPr>
+        <w:t xml:space="preserve">67%</w:t>
+      </w:r>
+      <w:r>
+        <w:t xml:space="preserve">: Error de cálculo - aplicar incorrectamente la fórmula de porcentaje</w:t>
+      </w:r>
+    </w:p>
+    <w:p>
+      <w:pPr>
+        <w:numPr>
+          <w:ilvl w:val="1"/>
+          <w:numId w:val="1013"/>
+        </w:numPr>
+      </w:pPr>
+      <w:r>
+        <w:rPr>
+          <w:b/>
+          <w:bCs/>
+        </w:rPr>
         <w:t xml:space="preserve">15%</w:t>
       </w:r>
       <w:r>
-        <w:t xml:space="preserve">: Error conceptual - confundir el valor absoluto (15 m³) con el porcentaje</w:t>
-      </w:r>
-    </w:p>
-    <w:p>
-      <w:pPr>
-        <w:numPr>
-          <w:ilvl w:val="1"/>
-          <w:numId w:val="1013"/>
-        </w:numPr>
-      </w:pPr>
+        <w:t xml:space="preserve">: Error de cálculo - aplicar incorrectamente la fórmula de porcentaje</w:t>
+      </w:r>
+    </w:p>
+    <w:p>
+      <w:pPr>
+        <w:pStyle w:val="Heading3"/>
+        <w:numPr>
+          <w:ilvl w:val="0"/>
+          <w:numId w:val="1000"/>
+        </w:numPr>
+      </w:pPr>
+      <w:bookmarkStart w:id="37" w:name="conclusiuxf3n"/>
+      <w:r>
+        <w:t xml:space="preserve">Conclusión</w:t>
+      </w:r>
+      <w:bookmarkEnd w:id="37"/>
+    </w:p>
+    <w:p>
+      <w:pPr>
+        <w:numPr>
+          <w:ilvl w:val="0"/>
+          <w:numId w:val="1000"/>
+        </w:numPr>
+      </w:pPr>
+      <w:r>
+        <w:t xml:space="preserve">El consumo de abril (12 metros cúbicos) representa el</w:t>
+      </w:r>
+      <w:r>
+        <w:t xml:space="preserve"> </w:t>
+      </w:r>
       <w:r>
         <w:rPr>
           <w:b/>
@@ -1637,65 +1701,9 @@
         <w:t xml:space="preserve">60%</w:t>
       </w:r>
       <w:r>
-        <w:t xml:space="preserve">: Error de lectura - usar el consumo de Septiembre en lugar de junio</w:t>
-      </w:r>
-    </w:p>
-    <w:p>
-      <w:pPr>
-        <w:numPr>
-          <w:ilvl w:val="1"/>
-          <w:numId w:val="1013"/>
-        </w:numPr>
-      </w:pPr>
-      <w:r>
-        <w:rPr>
-          <w:b/>
-          <w:bCs/>
-        </w:rPr>
-        <w:t xml:space="preserve">94%</w:t>
-      </w:r>
-      <w:r>
-        <w:t xml:space="preserve">: Error de cálculo - aplicar incorrectamente la fórmula de porcentaje</w:t>
-      </w:r>
-    </w:p>
-    <w:p>
-      <w:pPr>
-        <w:pStyle w:val="Heading3"/>
-        <w:numPr>
-          <w:ilvl w:val="0"/>
-          <w:numId w:val="1000"/>
-        </w:numPr>
-      </w:pPr>
-      <w:bookmarkStart w:id="37" w:name="conclusiuxf3n"/>
-      <w:r>
-        <w:t xml:space="preserve">Conclusión</w:t>
-      </w:r>
-      <w:bookmarkEnd w:id="37"/>
-    </w:p>
-    <w:p>
-      <w:pPr>
-        <w:numPr>
-          <w:ilvl w:val="0"/>
-          <w:numId w:val="1000"/>
-        </w:numPr>
-      </w:pPr>
-      <w:r>
-        <w:t xml:space="preserve">El consumo de junio (15 metros cúbicos) representa el</w:t>
-      </w:r>
-      <w:r>
         <w:t xml:space="preserve"> </w:t>
       </w:r>
       <w:r>
-        <w:rPr>
-          <w:b/>
-          <w:bCs/>
-        </w:rPr>
-        <w:t xml:space="preserve">75%</w:t>
-      </w:r>
-      <w:r>
-        <w:t xml:space="preserve"> </w:t>
-      </w:r>
-      <w:r>
         <w:t xml:space="preserve">del consumo máximo posible (20 metros cúbicos).</w:t>
       </w:r>
     </w:p>
@@ -1746,11 +1754,40 @@
     <w:p>
       <w:pPr>
         <w:numPr>
+          <w:ilvl w:val="0"/>
+          <w:numId w:val="1000"/>
+        </w:numPr>
+      </w:pPr>
+      <w:r>
+        <w:rPr>
+          <w:b/>
+          <w:bCs/>
+        </w:rPr>
+        <w:t xml:space="preserve">Verificación adicional</w:t>
+      </w:r>
+      <w:r>
+        <w:t xml:space="preserve">: La factura de septiembre ($12.150) corresponde exactamente al consumo mostrado en la gráfica (11 m³ × $850 + $2.800 cargo fijo).</w:t>
+      </w:r>
+    </w:p>
+    <w:p>
+      <w:pPr>
+        <w:numPr>
           <w:ilvl w:val="1"/>
           <w:numId w:val="1015"/>
         </w:numPr>
       </w:pPr>
       <w:r>
+        <w:t xml:space="preserve">Correcto</w:t>
+      </w:r>
+    </w:p>
+    <w:p>
+      <w:pPr>
+        <w:numPr>
+          <w:ilvl w:val="1"/>
+          <w:numId w:val="1015"/>
+        </w:numPr>
+      </w:pPr>
+      <w:r>
         <w:t xml:space="preserve">Incorrecto</w:t>
       </w:r>
     </w:p>
@@ -1773,17 +1810,6 @@
         </w:numPr>
       </w:pPr>
       <w:r>
-        <w:t xml:space="preserve">Correcto</w:t>
-      </w:r>
-    </w:p>
-    <w:p>
-      <w:pPr>
-        <w:numPr>
-          <w:ilvl w:val="1"/>
-          <w:numId w:val="1015"/>
-        </w:numPr>
-      </w:pPr>
-      <w:r>
         <w:t xml:space="preserve">Incorrecto</w:t>
       </w:r>
     </w:p>
@@ -1805,32 +1831,7 @@
         <w:br/>
       </w:r>
       <w:r>
-        <w:t xml:space="preserve">José y Laura viven en un hogar y comparten el pago de los gastos. En octubre consumieron 15 metros cúbicos de gas natural y la factura fue de</w:t>
-      </w:r>
-      <w:r>
-        <w:t xml:space="preserve"> </w:t>
-      </w:r>
-      <m:oMath>
-        <m:r>
-          <m:t>19.950</m:t>
-        </m:r>
-      </m:oMath>
-      <w:r>
-        <w:t xml:space="preserve">, incluido el cargo fijo de</w:t>
-      </w:r>
-      <w:r>
-        <w:t xml:space="preserve"> </w:t>
-      </w:r>
-      <m:oMath>
-        <m:r>
-          <m:t>2.700</m:t>
-        </m:r>
-      </m:oMath>
-      <w:r>
-        <w:t xml:space="preserve"> </w:t>
-      </w:r>
-      <w:r>
-        <w:t xml:space="preserve">que es el mismo todos los meses. La gráfica muestra el consumo histórico en metros cúbicos de ese servicio.</w:t>
+        <w:t xml:space="preserve">Diego y Camila viven en un aparta-estudio y comparten el pago de los gastos. En noviembre consumieron 14 metros cúbicos de gas natural y la factura fue de $19.500, incluido el cargo fijo de $2.700 que es el mismo todos los meses. La gráfica muestra el consumo histórico en metros cúbicos de ese servicio.</w:t>
       </w:r>
     </w:p>
     <w:p>
@@ -1891,7 +1892,7 @@
         </w:numPr>
       </w:pPr>
       <w:r>
-        <w:t xml:space="preserve">Un hogar puede consumir máximo 25 metros cúbicos en un mes. ¿A qué porcentaje del consumo máximo posible corresponde el consumo de junio?</w:t>
+        <w:t xml:space="preserve">Un hogar puede consumir máximo 25 metros cúbicos en un mes. ¿A qué porcentaje del consumo máximo posible corresponde el consumo de agosto?</w:t>
       </w:r>
     </w:p>
     <w:p>
@@ -1902,45 +1903,45 @@
         </w:numPr>
       </w:pPr>
       <w:r>
+        <w:t xml:space="preserve">80%</w:t>
+      </w:r>
+    </w:p>
+    <w:p>
+      <w:pPr>
+        <w:numPr>
+          <w:ilvl w:val="1"/>
+          <w:numId w:val="1016"/>
+        </w:numPr>
+      </w:pPr>
+      <w:r>
+        <w:t xml:space="preserve">52%</w:t>
+      </w:r>
+    </w:p>
+    <w:p>
+      <w:pPr>
+        <w:numPr>
+          <w:ilvl w:val="1"/>
+          <w:numId w:val="1016"/>
+        </w:numPr>
+      </w:pPr>
+      <w:r>
+        <w:t xml:space="preserve">16%</w:t>
+      </w:r>
+    </w:p>
+    <w:p>
+      <w:pPr>
+        <w:numPr>
+          <w:ilvl w:val="1"/>
+          <w:numId w:val="1016"/>
+        </w:numPr>
+      </w:pPr>
+      <w:r>
         <w:t xml:space="preserve">64%</w:t>
       </w:r>
     </w:p>
     <w:p>
       <w:pPr>
         <w:numPr>
-          <w:ilvl w:val="1"/>
-          <w:numId w:val="1016"/>
-        </w:numPr>
-      </w:pPr>
-      <w:r>
-        <w:t xml:space="preserve">40%</w:t>
-      </w:r>
-    </w:p>
-    <w:p>
-      <w:pPr>
-        <w:numPr>
-          <w:ilvl w:val="1"/>
-          <w:numId w:val="1016"/>
-        </w:numPr>
-      </w:pPr>
-      <w:r>
-        <w:t xml:space="preserve">73%</w:t>
-      </w:r>
-    </w:p>
-    <w:p>
-      <w:pPr>
-        <w:numPr>
-          <w:ilvl w:val="1"/>
-          <w:numId w:val="1016"/>
-        </w:numPr>
-      </w:pPr>
-      <w:r>
-        <w:t xml:space="preserve">16%</w:t>
-      </w:r>
-    </w:p>
-    <w:p>
-      <w:pPr>
-        <w:numPr>
           <w:ilvl w:val="0"/>
           <w:numId w:val="1000"/>
         </w:numPr>
@@ -2095,7 +2096,7 @@
         </w:numPr>
       </w:pPr>
       <w:r>
-        <w:t xml:space="preserve">Observando la gráfica de consumo histórico de José y Laura:</w:t>
+        <w:t xml:space="preserve">Observando la gráfica de consumo histórico de Diego y Camila:</w:t>
       </w:r>
     </w:p>
     <w:p>
@@ -2121,7 +2122,7 @@
         </w:numPr>
       </w:pPr>
       <w:r>
-        <w:t xml:space="preserve">Abril: 10 metros cúbicos</w:t>
+        <w:t xml:space="preserve">Mayo: 14 metros cúbicos</w:t>
       </w:r>
     </w:p>
     <w:p>
@@ -2132,7 +2133,7 @@
         </w:numPr>
       </w:pPr>
       <w:r>
-        <w:t xml:space="preserve">Mayo: 12 metros cúbicos</w:t>
+        <w:t xml:space="preserve">Junio: 15 metros cúbicos</w:t>
       </w:r>
     </w:p>
     <w:p>
@@ -2143,7 +2144,7 @@
         </w:numPr>
       </w:pPr>
       <w:r>
-        <w:t xml:space="preserve">Junio: 16 metros cúbicos</w:t>
+        <w:t xml:space="preserve">Julio: 12 metros cúbicos</w:t>
       </w:r>
     </w:p>
     <w:p>
@@ -2154,7 +2155,17 @@
         </w:numPr>
       </w:pPr>
       <w:r>
-        <w:t xml:space="preserve">Julio: 13 metros cúbicos</w:t>
+        <w:t xml:space="preserve">Agosto: 16 metros cúbicos ←</w:t>
+      </w:r>
+      <w:r>
+        <w:t xml:space="preserve"> </w:t>
+      </w:r>
+      <w:r>
+        <w:rPr>
+          <w:b/>
+          <w:bCs/>
+        </w:rPr>
+        <w:t xml:space="preserve">MES DE LA PREGUNTA</w:t>
       </w:r>
     </w:p>
     <w:p>
@@ -2165,7 +2176,7 @@
         </w:numPr>
       </w:pPr>
       <w:r>
-        <w:t xml:space="preserve">Agosto: 11 metros cúbicos</w:t>
+        <w:t xml:space="preserve">Septiembre: 13 metros cúbicos</w:t>
       </w:r>
     </w:p>
     <w:p>
@@ -2176,7 +2187,7 @@
         </w:numPr>
       </w:pPr>
       <w:r>
-        <w:t xml:space="preserve">Septiembre: 13 metros cúbicos</w:t>
+        <w:t xml:space="preserve">Octubre: 10 metros cúbicos</w:t>
       </w:r>
     </w:p>
     <w:p>
@@ -2187,22 +2198,32 @@
         </w:numPr>
       </w:pPr>
       <w:r>
-        <w:t xml:space="preserve">Octubre: 15 metros cúbicos</w:t>
-      </w:r>
-    </w:p>
-    <w:p>
-      <w:pPr>
-        <w:numPr>
-          <w:ilvl w:val="0"/>
-          <w:numId w:val="1000"/>
-        </w:numPr>
-      </w:pPr>
-      <w:r>
-        <w:rPr>
-          <w:b/>
-          <w:bCs/>
-        </w:rPr>
-        <w:t xml:space="preserve">El consumo de junio fue de 16 metros cúbicos.</w:t>
+        <w:t xml:space="preserve">Noviembre: 14 metros cúbicos ←</w:t>
+      </w:r>
+      <w:r>
+        <w:t xml:space="preserve"> </w:t>
+      </w:r>
+      <w:r>
+        <w:rPr>
+          <w:b/>
+          <w:bCs/>
+        </w:rPr>
+        <w:t xml:space="preserve">MES DE LA FACTURA</w:t>
+      </w:r>
+    </w:p>
+    <w:p>
+      <w:pPr>
+        <w:numPr>
+          <w:ilvl w:val="0"/>
+          <w:numId w:val="1000"/>
+        </w:numPr>
+      </w:pPr>
+      <w:r>
+        <w:rPr>
+          <w:b/>
+          <w:bCs/>
+        </w:rPr>
+        <w:t xml:space="preserve">El consumo de agosto fue de 16 metros cúbicos.</w:t>
       </w:r>
     </w:p>
     <w:p>
@@ -2252,7 +2273,7 @@
           <w:b/>
           <w:bCs/>
         </w:rPr>
-        <w:t xml:space="preserve">Consumo real de junio:</w:t>
+        <w:t xml:space="preserve">Consumo real de agosto:</w:t>
       </w:r>
       <w:r>
         <w:t xml:space="preserve"> </w:t>
@@ -2510,10 +2531,10 @@
           <w:b/>
           <w:bCs/>
         </w:rPr>
-        <w:t xml:space="preserve">40%</w:t>
-      </w:r>
-      <w:r>
-        <w:t xml:space="preserve">: Error de lectura - usar el consumo de Abril en lugar de junio</w:t>
+        <w:t xml:space="preserve">52%</w:t>
+      </w:r>
+      <w:r>
+        <w:t xml:space="preserve">: Error de lectura - usar el consumo de septiembre en lugar de agosto</w:t>
       </w:r>
     </w:p>
     <w:p>
@@ -2528,7 +2549,7 @@
           <w:b/>
           <w:bCs/>
         </w:rPr>
-        <w:t xml:space="preserve">73%</w:t>
+        <w:t xml:space="preserve">80%</w:t>
       </w:r>
       <w:r>
         <w:t xml:space="preserve">: Error de cálculo - aplicar incorrectamente la fórmula de porcentaje</w:t>
@@ -2556,7 +2577,7 @@
         </w:numPr>
       </w:pPr>
       <w:r>
-        <w:t xml:space="preserve">El consumo de junio (16 metros cúbicos) representa el</w:t>
+        <w:t xml:space="preserve">El consumo de agosto (16 metros cúbicos) representa el</w:t>
       </w:r>
       <w:r>
         <w:t xml:space="preserve"> </w:t>
@@ -2622,50 +2643,68 @@
     <w:p>
       <w:pPr>
         <w:numPr>
+          <w:ilvl w:val="0"/>
+          <w:numId w:val="1000"/>
+        </w:numPr>
+      </w:pPr>
+      <w:r>
+        <w:rPr>
+          <w:b/>
+          <w:bCs/>
+        </w:rPr>
+        <w:t xml:space="preserve">Verificación adicional</w:t>
+      </w:r>
+      <w:r>
+        <w:t xml:space="preserve">: La factura de noviembre ($19.500) corresponde exactamente al consumo mostrado en la gráfica (14 m³ × $1.200 + $2.700 cargo fijo).</w:t>
+      </w:r>
+    </w:p>
+    <w:p>
+      <w:pPr>
+        <w:numPr>
           <w:ilvl w:val="1"/>
           <w:numId w:val="1022"/>
         </w:numPr>
       </w:pPr>
       <w:r>
+        <w:t xml:space="preserve">Incorrecto</w:t>
+      </w:r>
+    </w:p>
+    <w:p>
+      <w:pPr>
+        <w:numPr>
+          <w:ilvl w:val="1"/>
+          <w:numId w:val="1022"/>
+        </w:numPr>
+      </w:pPr>
+      <w:r>
+        <w:t xml:space="preserve">Incorrecto</w:t>
+      </w:r>
+    </w:p>
+    <w:p>
+      <w:pPr>
+        <w:numPr>
+          <w:ilvl w:val="1"/>
+          <w:numId w:val="1022"/>
+        </w:numPr>
+      </w:pPr>
+      <w:r>
+        <w:t xml:space="preserve">Incorrecto</w:t>
+      </w:r>
+    </w:p>
+    <w:p>
+      <w:pPr>
+        <w:numPr>
+          <w:ilvl w:val="1"/>
+          <w:numId w:val="1022"/>
+        </w:numPr>
+      </w:pPr>
+      <w:r>
         <w:t xml:space="preserve">Correcto</w:t>
       </w:r>
     </w:p>
     <w:p>
       <w:pPr>
         <w:numPr>
-          <w:ilvl w:val="1"/>
-          <w:numId w:val="1022"/>
-        </w:numPr>
-      </w:pPr>
-      <w:r>
-        <w:t xml:space="preserve">Incorrecto</w:t>
-      </w:r>
-    </w:p>
-    <w:p>
-      <w:pPr>
-        <w:numPr>
-          <w:ilvl w:val="1"/>
-          <w:numId w:val="1022"/>
-        </w:numPr>
-      </w:pPr>
-      <w:r>
-        <w:t xml:space="preserve">Incorrecto</w:t>
-      </w:r>
-    </w:p>
-    <w:p>
-      <w:pPr>
-        <w:numPr>
-          <w:ilvl w:val="1"/>
-          <w:numId w:val="1022"/>
-        </w:numPr>
-      </w:pPr>
-      <w:r>
-        <w:t xml:space="preserve">Incorrecto</w:t>
-      </w:r>
-    </w:p>
-    <w:p>
-      <w:pPr>
-        <w:numPr>
           <w:ilvl w:val="0"/>
           <w:numId w:val="1001"/>
         </w:numPr>
@@ -2681,32 +2720,7 @@
         <w:br/>
       </w:r>
       <w:r>
-        <w:t xml:space="preserve">Valentina y José viven en un aparta-estudio y comparten el pago de los gastos. En octubre consumieron 13 metros cúbicos de gas natural y la factura fue de</w:t>
-      </w:r>
-      <w:r>
-        <w:t xml:space="preserve"> </w:t>
-      </w:r>
-      <m:oMath>
-        <m:r>
-          <m:t>14.900</m:t>
-        </m:r>
-      </m:oMath>
-      <w:r>
-        <w:t xml:space="preserve">, incluido el cargo fijo de</w:t>
-      </w:r>
-      <w:r>
-        <w:t xml:space="preserve"> </w:t>
-      </w:r>
-      <m:oMath>
-        <m:r>
-          <m:t>3.200</m:t>
-        </m:r>
-      </m:oMath>
-      <w:r>
-        <w:t xml:space="preserve"> </w:t>
-      </w:r>
-      <w:r>
-        <w:t xml:space="preserve">que es el mismo todos los meses. La gráfica muestra el consumo histórico en metros cúbicos de ese servicio.</w:t>
+        <w:t xml:space="preserve">Andrés y Carmen viven en un aparta-estudio y comparten el pago de los gastos. En noviembre consumieron 12 metros cúbicos de gas natural y la factura fue de $13.300, incluido el cargo fijo de $2.500 que es el mismo todos los meses. La gráfica muestra el consumo histórico en metros cúbicos de ese servicio.</w:t>
       </w:r>
     </w:p>
     <w:p>
@@ -2767,7 +2781,7 @@
         </w:numPr>
       </w:pPr>
       <w:r>
-        <w:t xml:space="preserve">Un hogar puede consumir máximo 25 metros cúbicos en un mes. ¿A qué porcentaje del consumo máximo posible corresponde el consumo de junio?</w:t>
+        <w:t xml:space="preserve">Un hogar puede consumir máximo 18 metros cúbicos en un mes. ¿A qué porcentaje del consumo máximo posible corresponde el consumo de agosto?</w:t>
       </w:r>
     </w:p>
     <w:p>
@@ -2778,7 +2792,7 @@
         </w:numPr>
       </w:pPr>
       <w:r>
-        <w:t xml:space="preserve">80%</w:t>
+        <w:t xml:space="preserve">61%</w:t>
       </w:r>
     </w:p>
     <w:p>
@@ -2789,7 +2803,7 @@
         </w:numPr>
       </w:pPr>
       <w:r>
-        <w:t xml:space="preserve">95%</w:t>
+        <w:t xml:space="preserve">67%</w:t>
       </w:r>
     </w:p>
     <w:p>
@@ -2800,7 +2814,7 @@
         </w:numPr>
       </w:pPr>
       <w:r>
-        <w:t xml:space="preserve">48%</w:t>
+        <w:t xml:space="preserve">85%</w:t>
       </w:r>
     </w:p>
     <w:p>
@@ -2811,7 +2825,7 @@
         </w:numPr>
       </w:pPr>
       <w:r>
-        <w:t xml:space="preserve">20%</w:t>
+        <w:t xml:space="preserve">11%</w:t>
       </w:r>
     </w:p>
     <w:p>
@@ -2971,7 +2985,7 @@
         </w:numPr>
       </w:pPr>
       <w:r>
-        <w:t xml:space="preserve">Observando la gráfica de consumo histórico de Valentina y José:</w:t>
+        <w:t xml:space="preserve">Observando la gráfica de consumo histórico de Andrés y Carmen:</w:t>
       </w:r>
     </w:p>
     <w:p>
@@ -2997,7 +3011,7 @@
         </w:numPr>
       </w:pPr>
       <w:r>
-        <w:t xml:space="preserve">Abril: 11 metros cúbicos</w:t>
+        <w:t xml:space="preserve">Mayo: 12 metros cúbicos</w:t>
       </w:r>
     </w:p>
     <w:p>
@@ -3008,7 +3022,7 @@
         </w:numPr>
       </w:pPr>
       <w:r>
-        <w:t xml:space="preserve">Mayo: 13 metros cúbicos</w:t>
+        <w:t xml:space="preserve">Junio: 14 metros cúbicos</w:t>
       </w:r>
     </w:p>
     <w:p>
@@ -3019,7 +3033,7 @@
         </w:numPr>
       </w:pPr>
       <w:r>
-        <w:t xml:space="preserve">Junio: 20 metros cúbicos</w:t>
+        <w:t xml:space="preserve">Julio: 13 metros cúbicos</w:t>
       </w:r>
     </w:p>
     <w:p>
@@ -3030,7 +3044,17 @@
         </w:numPr>
       </w:pPr>
       <w:r>
-        <w:t xml:space="preserve">Julio: 11 metros cúbicos</w:t>
+        <w:t xml:space="preserve">Agosto: 11 metros cúbicos ←</w:t>
+      </w:r>
+      <w:r>
+        <w:t xml:space="preserve"> </w:t>
+      </w:r>
+      <w:r>
+        <w:rPr>
+          <w:b/>
+          <w:bCs/>
+        </w:rPr>
+        <w:t xml:space="preserve">MES DE LA PREGUNTA</w:t>
       </w:r>
     </w:p>
     <w:p>
@@ -3041,7 +3065,7 @@
         </w:numPr>
       </w:pPr>
       <w:r>
-        <w:t xml:space="preserve">Agosto: 12 metros cúbicos</w:t>
+        <w:t xml:space="preserve">Septiembre: 10 metros cúbicos</w:t>
       </w:r>
     </w:p>
     <w:p>
@@ -3052,7 +3076,7 @@
         </w:numPr>
       </w:pPr>
       <w:r>
-        <w:t xml:space="preserve">Septiembre: 13 metros cúbicos</w:t>
+        <w:t xml:space="preserve">Octubre: 13 metros cúbicos</w:t>
       </w:r>
     </w:p>
     <w:p>
@@ -3063,22 +3087,32 @@
         </w:numPr>
       </w:pPr>
       <w:r>
-        <w:t xml:space="preserve">Octubre: 13 metros cúbicos</w:t>
-      </w:r>
-    </w:p>
-    <w:p>
-      <w:pPr>
-        <w:numPr>
-          <w:ilvl w:val="0"/>
-          <w:numId w:val="1000"/>
-        </w:numPr>
-      </w:pPr>
-      <w:r>
-        <w:rPr>
-          <w:b/>
-          <w:bCs/>
-        </w:rPr>
-        <w:t xml:space="preserve">El consumo de junio fue de 20 metros cúbicos.</w:t>
+        <w:t xml:space="preserve">Noviembre: 12 metros cúbicos ←</w:t>
+      </w:r>
+      <w:r>
+        <w:t xml:space="preserve"> </w:t>
+      </w:r>
+      <w:r>
+        <w:rPr>
+          <w:b/>
+          <w:bCs/>
+        </w:rPr>
+        <w:t xml:space="preserve">MES DE LA FACTURA</w:t>
+      </w:r>
+    </w:p>
+    <w:p>
+      <w:pPr>
+        <w:numPr>
+          <w:ilvl w:val="0"/>
+          <w:numId w:val="1000"/>
+        </w:numPr>
+      </w:pPr>
+      <w:r>
+        <w:rPr>
+          <w:b/>
+          <w:bCs/>
+        </w:rPr>
+        <w:t xml:space="preserve">El consumo de agosto fue de 11 metros cúbicos.</w:t>
       </w:r>
     </w:p>
     <w:p>
@@ -3113,7 +3147,7 @@
         <w:t xml:space="preserve"> </w:t>
       </w:r>
       <w:r>
-        <w:t xml:space="preserve">25 metros cúbicos (dato del enunciado)</w:t>
+        <w:t xml:space="preserve">18 metros cúbicos (dato del enunciado)</w:t>
       </w:r>
     </w:p>
     <w:p>
@@ -3128,13 +3162,13 @@
           <w:b/>
           <w:bCs/>
         </w:rPr>
-        <w:t xml:space="preserve">Consumo real de junio:</w:t>
+        <w:t xml:space="preserve">Consumo real de agosto:</w:t>
       </w:r>
       <w:r>
         <w:t xml:space="preserve"> </w:t>
       </w:r>
       <w:r>
-        <w:t xml:space="preserve">20 metros cúbicos (dato de la gráfica)</w:t>
+        <w:t xml:space="preserve">11 metros cúbicos (dato de la gráfica)</w:t>
       </w:r>
     </w:p>
     <w:p>
@@ -3264,12 +3298,12 @@
             </m:fPr>
             <m:num>
               <m:r>
-                <m:t>20</m:t>
+                <m:t>11</m:t>
               </m:r>
             </m:num>
             <m:den>
               <m:r>
-                <m:t>25</m:t>
+                <m:t>18</m:t>
               </m:r>
             </m:den>
           </m:f>
@@ -3295,7 +3329,7 @@
             <m:t>=</m:t>
           </m:r>
           <m:r>
-            <m:t>80</m:t>
+            <m:t>61</m:t>
           </m:r>
           <m:r>
             <m:rPr>
@@ -3338,7 +3372,7 @@
         <w:t xml:space="preserve"> </w:t>
       </w:r>
       <w:r>
-        <w:t xml:space="preserve">80%</w:t>
+        <w:t xml:space="preserve">61%</w:t>
       </w:r>
     </w:p>
     <w:p>
@@ -3368,10 +3402,10 @@
           <w:b/>
           <w:bCs/>
         </w:rPr>
-        <w:t xml:space="preserve">20%</w:t>
-      </w:r>
-      <w:r>
-        <w:t xml:space="preserve">: Error conceptual - confundir el valor absoluto (20 m³) con el porcentaje</w:t>
+        <w:t xml:space="preserve">11%</w:t>
+      </w:r>
+      <w:r>
+        <w:t xml:space="preserve">: Error conceptual - confundir el valor absoluto (11 m³) con el porcentaje</w:t>
       </w:r>
     </w:p>
     <w:p>
@@ -3386,10 +3420,10 @@
           <w:b/>
           <w:bCs/>
         </w:rPr>
-        <w:t xml:space="preserve">48%</w:t>
-      </w:r>
-      <w:r>
-        <w:t xml:space="preserve">: Error de lectura - usar el consumo de Agosto en lugar de junio</w:t>
+        <w:t xml:space="preserve">67%</w:t>
+      </w:r>
+      <w:r>
+        <w:t xml:space="preserve">: Error de lectura - usar el consumo de mayo en lugar de agosto</w:t>
       </w:r>
     </w:p>
     <w:p>
@@ -3404,7 +3438,7 @@
           <w:b/>
           <w:bCs/>
         </w:rPr>
-        <w:t xml:space="preserve">95%</w:t>
+        <w:t xml:space="preserve">85%</w:t>
       </w:r>
       <w:r>
         <w:t xml:space="preserve">: Error de cálculo - aplicar incorrectamente la fórmula de porcentaje</w:t>
@@ -3432,7 +3466,7 @@
         </w:numPr>
       </w:pPr>
       <w:r>
-        <w:t xml:space="preserve">El consumo de junio (20 metros cúbicos) representa el</w:t>
+        <w:t xml:space="preserve">El consumo de agosto (11 metros cúbicos) representa el</w:t>
       </w:r>
       <w:r>
         <w:t xml:space="preserve"> </w:t>
@@ -3442,13 +3476,13 @@
           <w:b/>
           <w:bCs/>
         </w:rPr>
-        <w:t xml:space="preserve">80%</w:t>
+        <w:t xml:space="preserve">61%</w:t>
       </w:r>
       <w:r>
         <w:t xml:space="preserve"> </w:t>
       </w:r>
       <w:r>
-        <w:t xml:space="preserve">del consumo máximo posible (25 metros cúbicos).</w:t>
+        <w:t xml:space="preserve">del consumo máximo posible (18 metros cúbicos).</w:t>
       </w:r>
     </w:p>
     <w:p>
@@ -3498,6 +3532,24 @@
     <w:p>
       <w:pPr>
         <w:numPr>
+          <w:ilvl w:val="0"/>
+          <w:numId w:val="1000"/>
+        </w:numPr>
+      </w:pPr>
+      <w:r>
+        <w:rPr>
+          <w:b/>
+          <w:bCs/>
+        </w:rPr>
+        <w:t xml:space="preserve">Verificación adicional</w:t>
+      </w:r>
+      <w:r>
+        <w:t xml:space="preserve">: La factura de noviembre ($13.300) corresponde exactamente al consumo mostrado en la gráfica (12 m³ × $900 + $2.500 cargo fijo).</w:t>
+      </w:r>
+    </w:p>
+    <w:p>
+      <w:pPr>
+        <w:numPr>
           <w:ilvl w:val="1"/>
           <w:numId w:val="1029"/>
         </w:numPr>
@@ -3557,32 +3609,7 @@
         <w:br/>
       </w:r>
       <w:r>
-        <w:t xml:space="preserve">José y María viven en un hogar y comparten el pago de los gastos. En octubre consumieron 15 metros cúbicos de gas natural y la factura fue de</w:t>
-      </w:r>
-      <w:r>
-        <w:t xml:space="preserve"> </w:t>
-      </w:r>
-      <m:oMath>
-        <m:r>
-          <m:t>16.200</m:t>
-        </m:r>
-      </m:oMath>
-      <w:r>
-        <w:t xml:space="preserve">, incluido el cargo fijo de</w:t>
-      </w:r>
-      <w:r>
-        <w:t xml:space="preserve"> </w:t>
-      </w:r>
-      <m:oMath>
-        <m:r>
-          <m:t>2.700</m:t>
-        </m:r>
-      </m:oMath>
-      <w:r>
-        <w:t xml:space="preserve"> </w:t>
-      </w:r>
-      <w:r>
-        <w:t xml:space="preserve">que es el mismo todos los meses. La gráfica muestra el consumo histórico en metros cúbicos de ese servicio.</w:t>
+        <w:t xml:space="preserve">Miguel y Isabella viven en un aparta-estudio y comparten el pago de los gastos. En diciembre consumieron 15 metros cúbicos de gas natural y la factura fue de $19.950, incluido el cargo fijo de $2.700 que es el mismo todos los meses. La gráfica muestra el consumo histórico en metros cúbicos de ese servicio.</w:t>
       </w:r>
     </w:p>
     <w:p>
@@ -3643,7 +3670,7 @@
         </w:numPr>
       </w:pPr>
       <w:r>
-        <w:t xml:space="preserve">Un hogar puede consumir máximo 22 metros cúbicos en un mes. ¿A qué porcentaje del consumo máximo posible corresponde el consumo de junio?</w:t>
+        <w:t xml:space="preserve">Un hogar puede consumir máximo 20 metros cúbicos en un mes. ¿A qué porcentaje del consumo máximo posible corresponde el consumo de noviembre?</w:t>
       </w:r>
     </w:p>
     <w:p>
@@ -3654,7 +3681,7 @@
         </w:numPr>
       </w:pPr>
       <w:r>
-        <w:t xml:space="preserve">19%</w:t>
+        <w:t xml:space="preserve">45%</w:t>
       </w:r>
     </w:p>
     <w:p>
@@ -3665,7 +3692,7 @@
         </w:numPr>
       </w:pPr>
       <w:r>
-        <w:t xml:space="preserve">86%</w:t>
+        <w:t xml:space="preserve">75%</w:t>
       </w:r>
     </w:p>
     <w:p>
@@ -3676,7 +3703,7 @@
         </w:numPr>
       </w:pPr>
       <w:r>
-        <w:t xml:space="preserve">68%</w:t>
+        <w:t xml:space="preserve">17%</w:t>
       </w:r>
     </w:p>
     <w:p>
@@ -3847,7 +3874,7 @@
         </w:numPr>
       </w:pPr>
       <w:r>
-        <w:t xml:space="preserve">Observando la gráfica de consumo histórico de José y María:</w:t>
+        <w:t xml:space="preserve">Observando la gráfica de consumo histórico de Miguel y Isabella:</w:t>
       </w:r>
     </w:p>
     <w:p>
@@ -3873,7 +3900,7 @@
         </w:numPr>
       </w:pPr>
       <w:r>
-        <w:t xml:space="preserve">Abril: 11 metros cúbicos</w:t>
+        <w:t xml:space="preserve">Junio: 15 metros cúbicos</w:t>
       </w:r>
     </w:p>
     <w:p>
@@ -3884,7 +3911,7 @@
         </w:numPr>
       </w:pPr>
       <w:r>
-        <w:t xml:space="preserve">Mayo: 12 metros cúbicos</w:t>
+        <w:t xml:space="preserve">Julio: 10 metros cúbicos</w:t>
       </w:r>
     </w:p>
     <w:p>
@@ -3895,7 +3922,7 @@
         </w:numPr>
       </w:pPr>
       <w:r>
-        <w:t xml:space="preserve">Junio: 19 metros cúbicos</w:t>
+        <w:t xml:space="preserve">Agosto: 15 metros cúbicos</w:t>
       </w:r>
     </w:p>
     <w:p>
@@ -3906,7 +3933,7 @@
         </w:numPr>
       </w:pPr>
       <w:r>
-        <w:t xml:space="preserve">Julio: 11 metros cúbicos</w:t>
+        <w:t xml:space="preserve">Septiembre: 13 metros cúbicos</w:t>
       </w:r>
     </w:p>
     <w:p>
@@ -3917,7 +3944,7 @@
         </w:numPr>
       </w:pPr>
       <w:r>
-        <w:t xml:space="preserve">Agosto: 13 metros cúbicos</w:t>
+        <w:t xml:space="preserve">Octubre: 15 metros cúbicos</w:t>
       </w:r>
     </w:p>
     <w:p>
@@ -3928,7 +3955,17 @@
         </w:numPr>
       </w:pPr>
       <w:r>
-        <w:t xml:space="preserve">Septiembre: 13 metros cúbicos</w:t>
+        <w:t xml:space="preserve">Noviembre: 17 metros cúbicos ←</w:t>
+      </w:r>
+      <w:r>
+        <w:t xml:space="preserve"> </w:t>
+      </w:r>
+      <w:r>
+        <w:rPr>
+          <w:b/>
+          <w:bCs/>
+        </w:rPr>
+        <w:t xml:space="preserve">MES DE LA PREGUNTA</w:t>
       </w:r>
     </w:p>
     <w:p>
@@ -3939,22 +3976,32 @@
         </w:numPr>
       </w:pPr>
       <w:r>
-        <w:t xml:space="preserve">Octubre: 15 metros cúbicos</w:t>
-      </w:r>
-    </w:p>
-    <w:p>
-      <w:pPr>
-        <w:numPr>
-          <w:ilvl w:val="0"/>
-          <w:numId w:val="1000"/>
-        </w:numPr>
-      </w:pPr>
-      <w:r>
-        <w:rPr>
-          <w:b/>
-          <w:bCs/>
-        </w:rPr>
-        <w:t xml:space="preserve">El consumo de junio fue de 19 metros cúbicos.</w:t>
+        <w:t xml:space="preserve">Diciembre: 15 metros cúbicos ←</w:t>
+      </w:r>
+      <w:r>
+        <w:t xml:space="preserve"> </w:t>
+      </w:r>
+      <w:r>
+        <w:rPr>
+          <w:b/>
+          <w:bCs/>
+        </w:rPr>
+        <w:t xml:space="preserve">MES DE LA FACTURA</w:t>
+      </w:r>
+    </w:p>
+    <w:p>
+      <w:pPr>
+        <w:numPr>
+          <w:ilvl w:val="0"/>
+          <w:numId w:val="1000"/>
+        </w:numPr>
+      </w:pPr>
+      <w:r>
+        <w:rPr>
+          <w:b/>
+          <w:bCs/>
+        </w:rPr>
+        <w:t xml:space="preserve">El consumo de noviembre fue de 17 metros cúbicos.</w:t>
       </w:r>
     </w:p>
     <w:p>
@@ -3989,7 +4036,7 @@
         <w:t xml:space="preserve"> </w:t>
       </w:r>
       <w:r>
-        <w:t xml:space="preserve">22 metros cúbicos (dato del enunciado)</w:t>
+        <w:t xml:space="preserve">20 metros cúbicos (dato del enunciado)</w:t>
       </w:r>
     </w:p>
     <w:p>
@@ -4004,13 +4051,13 @@
           <w:b/>
           <w:bCs/>
         </w:rPr>
-        <w:t xml:space="preserve">Consumo real de junio:</w:t>
+        <w:t xml:space="preserve">Consumo real de noviembre:</w:t>
       </w:r>
       <w:r>
         <w:t xml:space="preserve"> </w:t>
       </w:r>
       <w:r>
-        <w:t xml:space="preserve">19 metros cúbicos (dato de la gráfica)</w:t>
+        <w:t xml:space="preserve">17 metros cúbicos (dato de la gráfica)</w:t>
       </w:r>
     </w:p>
     <w:p>
@@ -4140,12 +4187,12 @@
             </m:fPr>
             <m:num>
               <m:r>
-                <m:t>19</m:t>
+                <m:t>17</m:t>
               </m:r>
             </m:num>
             <m:den>
               <m:r>
-                <m:t>22</m:t>
+                <m:t>20</m:t>
               </m:r>
             </m:den>
           </m:f>
@@ -4171,7 +4218,7 @@
             <m:t>=</m:t>
           </m:r>
           <m:r>
-            <m:t>86</m:t>
+            <m:t>85</m:t>
           </m:r>
           <m:r>
             <m:rPr>
@@ -4214,7 +4261,7 @@
         <w:t xml:space="preserve"> </w:t>
       </w:r>
       <w:r>
-        <w:t xml:space="preserve">86%</w:t>
+        <w:t xml:space="preserve">85%</w:t>
       </w:r>
     </w:p>
     <w:p>
@@ -4244,10 +4291,10 @@
           <w:b/>
           <w:bCs/>
         </w:rPr>
-        <w:t xml:space="preserve">19%</w:t>
-      </w:r>
-      <w:r>
-        <w:t xml:space="preserve">: Error conceptual - confundir el valor absoluto (19 m³) con el porcentaje</w:t>
+        <w:t xml:space="preserve">17%</w:t>
+      </w:r>
+      <w:r>
+        <w:t xml:space="preserve">: Error conceptual - confundir el valor absoluto (17 m³) con el porcentaje</w:t>
       </w:r>
     </w:p>
     <w:p>
@@ -4262,10 +4309,10 @@
           <w:b/>
           <w:bCs/>
         </w:rPr>
-        <w:t xml:space="preserve">68%</w:t>
-      </w:r>
-      <w:r>
-        <w:t xml:space="preserve">: Error de lectura - usar el consumo de Octubre en lugar de junio</w:t>
+        <w:t xml:space="preserve">75%</w:t>
+      </w:r>
+      <w:r>
+        <w:t xml:space="preserve">: Error de lectura - usar el consumo de junio en lugar de noviembre</w:t>
       </w:r>
     </w:p>
     <w:p>
@@ -4280,51 +4327,51 @@
           <w:b/>
           <w:bCs/>
         </w:rPr>
+        <w:t xml:space="preserve">45%</w:t>
+      </w:r>
+      <w:r>
+        <w:t xml:space="preserve">: Error de cálculo - aplicar incorrectamente la fórmula de porcentaje</w:t>
+      </w:r>
+    </w:p>
+    <w:p>
+      <w:pPr>
+        <w:pStyle w:val="Heading3"/>
+        <w:numPr>
+          <w:ilvl w:val="0"/>
+          <w:numId w:val="1000"/>
+        </w:numPr>
+      </w:pPr>
+      <w:bookmarkStart w:id="64" w:name="conclusiuxf3n"/>
+      <w:r>
+        <w:t xml:space="preserve">Conclusión</w:t>
+      </w:r>
+      <w:bookmarkEnd w:id="64"/>
+    </w:p>
+    <w:p>
+      <w:pPr>
+        <w:numPr>
+          <w:ilvl w:val="0"/>
+          <w:numId w:val="1000"/>
+        </w:numPr>
+      </w:pPr>
+      <w:r>
+        <w:t xml:space="preserve">El consumo de noviembre (17 metros cúbicos) representa el</w:t>
+      </w:r>
+      <w:r>
+        <w:t xml:space="preserve"> </w:t>
+      </w:r>
+      <w:r>
+        <w:rPr>
+          <w:b/>
+          <w:bCs/>
+        </w:rPr>
         <w:t xml:space="preserve">85%</w:t>
       </w:r>
       <w:r>
-        <w:t xml:space="preserve">: Error de cálculo - aplicar incorrectamente la fórmula de porcentaje</w:t>
-      </w:r>
-    </w:p>
-    <w:p>
-      <w:pPr>
-        <w:pStyle w:val="Heading3"/>
-        <w:numPr>
-          <w:ilvl w:val="0"/>
-          <w:numId w:val="1000"/>
-        </w:numPr>
-      </w:pPr>
-      <w:bookmarkStart w:id="64" w:name="conclusiuxf3n"/>
-      <w:r>
-        <w:t xml:space="preserve">Conclusión</w:t>
-      </w:r>
-      <w:bookmarkEnd w:id="64"/>
-    </w:p>
-    <w:p>
-      <w:pPr>
-        <w:numPr>
-          <w:ilvl w:val="0"/>
-          <w:numId w:val="1000"/>
-        </w:numPr>
-      </w:pPr>
-      <w:r>
-        <w:t xml:space="preserve">El consumo de junio (19 metros cúbicos) representa el</w:t>
-      </w:r>
-      <w:r>
         <w:t xml:space="preserve"> </w:t>
       </w:r>
       <w:r>
-        <w:rPr>
-          <w:b/>
-          <w:bCs/>
-        </w:rPr>
-        <w:t xml:space="preserve">86%</w:t>
-      </w:r>
-      <w:r>
-        <w:t xml:space="preserve"> </w:t>
-      </w:r>
-      <w:r>
-        <w:t xml:space="preserve">del consumo máximo posible (22 metros cúbicos).</w:t>
+        <w:t xml:space="preserve">del consumo máximo posible (20 metros cúbicos).</w:t>
       </w:r>
     </w:p>
     <w:p>
@@ -4374,6 +4421,24 @@
     <w:p>
       <w:pPr>
         <w:numPr>
+          <w:ilvl w:val="0"/>
+          <w:numId w:val="1000"/>
+        </w:numPr>
+      </w:pPr>
+      <w:r>
+        <w:rPr>
+          <w:b/>
+          <w:bCs/>
+        </w:rPr>
+        <w:t xml:space="preserve">Verificación adicional</w:t>
+      </w:r>
+      <w:r>
+        <w:t xml:space="preserve">: La factura de diciembre ($19.950) corresponde exactamente al consumo mostrado en la gráfica (15 m³ × $1.150 + $2.700 cargo fijo).</w:t>
+      </w:r>
+    </w:p>
+    <w:p>
+      <w:pPr>
+        <w:numPr>
           <w:ilvl w:val="1"/>
           <w:numId w:val="1036"/>
         </w:numPr>
@@ -4390,29 +4455,29 @@
         </w:numPr>
       </w:pPr>
       <w:r>
+        <w:t xml:space="preserve">Incorrecto</w:t>
+      </w:r>
+    </w:p>
+    <w:p>
+      <w:pPr>
+        <w:numPr>
+          <w:ilvl w:val="1"/>
+          <w:numId w:val="1036"/>
+        </w:numPr>
+      </w:pPr>
+      <w:r>
+        <w:t xml:space="preserve">Incorrecto</w:t>
+      </w:r>
+    </w:p>
+    <w:p>
+      <w:pPr>
+        <w:numPr>
+          <w:ilvl w:val="1"/>
+          <w:numId w:val="1036"/>
+        </w:numPr>
+      </w:pPr>
+      <w:r>
         <w:t xml:space="preserve">Correcto</w:t>
-      </w:r>
-    </w:p>
-    <w:p>
-      <w:pPr>
-        <w:numPr>
-          <w:ilvl w:val="1"/>
-          <w:numId w:val="1036"/>
-        </w:numPr>
-      </w:pPr>
-      <w:r>
-        <w:t xml:space="preserve">Incorrecto</w:t>
-      </w:r>
-    </w:p>
-    <w:p>
-      <w:pPr>
-        <w:numPr>
-          <w:ilvl w:val="1"/>
-          <w:numId w:val="1036"/>
-        </w:numPr>
-      </w:pPr>
-      <w:r>
-        <w:t xml:space="preserve">Incorrecto</w:t>
       </w:r>
     </w:p>
     <w:bookmarkEnd w:id="65"/>

</xml_diff>